<commit_message>
Remove junk essay question #6 and keep choice options in original A, B, C, D, E order while randomizing question order
</commit_message>
<xml_diff>
--- a/soal matematika/Kelas XI/Fungsi Komposisi dan Fungsi Invers/Soal Essay kelas XI.docx
+++ b/soal matematika/Kelas XI/Fungsi Komposisi dan Fungsi Invers/Soal Essay kelas XI.docx
@@ -1803,57 +1803,6 @@
         </w:rPr>
         <w:t>?</w:t>
       </w:r>
-    </w:p>
-    <w:p>
-      <w:pPr>
-        <w:pStyle w:val="ListParagraph"/>
-        <w:jc w:val="both"/>
-        <w:rPr>
-          <w:color w:val="4472C4" w:themeColor="accent1"/>
-          <w:sz w:val="20"/>
-          <w:szCs w:val="20"/>
-        </w:rPr>
-      </w:pPr>
-      <w:r>
-        <w:rPr>
-          <w:rFonts w:eastAsiaTheme="minorEastAsia"/>
-          <w:color w:val="4472C4" w:themeColor="accent1"/>
-          <w:sz w:val="20"/>
-          <w:szCs w:val="20"/>
-        </w:rPr>
-        <w:t xml:space="preserve">SNBT 2019-2021 yang </w:t>
-      </w:r>
-      <w:proofErr w:type="spellStart"/>
-      <w:r>
-        <w:rPr>
-          <w:rFonts w:eastAsiaTheme="minorEastAsia"/>
-          <w:color w:val="4472C4" w:themeColor="accent1"/>
-          <w:sz w:val="20"/>
-          <w:szCs w:val="20"/>
-        </w:rPr>
-        <w:t>telah</w:t>
-      </w:r>
-      <w:proofErr w:type="spellEnd"/>
-      <w:r>
-        <w:rPr>
-          <w:rFonts w:eastAsiaTheme="minorEastAsia"/>
-          <w:color w:val="4472C4" w:themeColor="accent1"/>
-          <w:sz w:val="20"/>
-          <w:szCs w:val="20"/>
-        </w:rPr>
-        <w:t xml:space="preserve"> </w:t>
-      </w:r>
-      <w:proofErr w:type="spellStart"/>
-      <w:r>
-        <w:rPr>
-          <w:rFonts w:eastAsiaTheme="minorEastAsia"/>
-          <w:color w:val="4472C4" w:themeColor="accent1"/>
-          <w:sz w:val="20"/>
-          <w:szCs w:val="20"/>
-        </w:rPr>
-        <w:t>dimodifikasi</w:t>
-      </w:r>
-      <w:proofErr w:type="spellEnd"/>
     </w:p>
     <w:sectPr>
       <w:pgSz w:w="11906" w:h="16838"/>

</xml_diff>